<commit_message>
Added word frequency programs
</commit_message>
<xml_diff>
--- a/Assignments/dailypractice.docx
+++ b/Assignments/dailypractice.docx
@@ -231,6 +231,224 @@
           <w:t>https://www.codechef.com/practice/course/java/LPJAAS01/problems/LJAAS10</w:t>
         </w:r>
       </w:hyperlink>
+    </w:p>
+    <w:p>
+      <w:pPr>
+        <w:pStyle w:val="ListParagraph"/>
+        <w:numPr>
+          <w:ilvl w:val="0"/>
+          <w:numId w:val="1"/>
+        </w:numPr>
+        <w:rPr>
+          <w:lang w:val="en-US"/>
+        </w:rPr>
+      </w:pPr>
+      <w:hyperlink r:id="rId15" w:history="1">
+        <w:r>
+          <w:rPr>
+            <w:rStyle w:val="Hyperlink"/>
+            <w:lang w:val="en-US"/>
+          </w:rPr>
+          <w:t>https://www.codechef.com/practice/course/java/LPJAAS02/problems/LJAAS11</w:t>
+        </w:r>
+      </w:hyperlink>
+    </w:p>
+    <w:p>
+      <w:pPr>
+        <w:pStyle w:val="ListParagraph"/>
+        <w:numPr>
+          <w:ilvl w:val="0"/>
+          <w:numId w:val="1"/>
+        </w:numPr>
+        <w:rPr>
+          <w:lang w:val="en-US"/>
+        </w:rPr>
+      </w:pPr>
+      <w:hyperlink r:id="rId16" w:history="1">
+        <w:r>
+          <w:rPr>
+            <w:rStyle w:val="Hyperlink"/>
+            <w:lang w:val="en-US"/>
+          </w:rPr>
+          <w:t>https://www.codechef.com/practice/course/java/LPJAAS02/problems/LJAAS12</w:t>
+        </w:r>
+      </w:hyperlink>
+    </w:p>
+    <w:p>
+      <w:pPr>
+        <w:pStyle w:val="ListParagraph"/>
+        <w:numPr>
+          <w:ilvl w:val="0"/>
+          <w:numId w:val="1"/>
+        </w:numPr>
+        <w:rPr>
+          <w:lang w:val="en-US"/>
+        </w:rPr>
+      </w:pPr>
+      <w:hyperlink r:id="rId17" w:history="1">
+        <w:r>
+          <w:rPr>
+            <w:rStyle w:val="Hyperlink"/>
+            <w:lang w:val="en-US"/>
+          </w:rPr>
+          <w:t>https://www.codechef.com/practice/course/java/LPJAAS02/problems/LJAAS13</w:t>
+        </w:r>
+      </w:hyperlink>
+    </w:p>
+    <w:p>
+      <w:pPr>
+        <w:pStyle w:val="ListParagraph"/>
+        <w:numPr>
+          <w:ilvl w:val="0"/>
+          <w:numId w:val="1"/>
+        </w:numPr>
+        <w:rPr>
+          <w:lang w:val="en-US"/>
+        </w:rPr>
+      </w:pPr>
+      <w:hyperlink r:id="rId18" w:history="1">
+        <w:r>
+          <w:rPr>
+            <w:rStyle w:val="Hyperlink"/>
+            <w:lang w:val="en-US"/>
+          </w:rPr>
+          <w:t>https://www.codechef.com/practice/course/java/LPJAAS02/problems/LJAAS14</w:t>
+        </w:r>
+      </w:hyperlink>
+    </w:p>
+    <w:p>
+      <w:pPr>
+        <w:pStyle w:val="ListParagraph"/>
+        <w:numPr>
+          <w:ilvl w:val="0"/>
+          <w:numId w:val="1"/>
+        </w:numPr>
+        <w:rPr>
+          <w:lang w:val="en-US"/>
+        </w:rPr>
+      </w:pPr>
+      <w:hyperlink r:id="rId19" w:history="1">
+        <w:r>
+          <w:rPr>
+            <w:rStyle w:val="Hyperlink"/>
+            <w:lang w:val="en-US"/>
+          </w:rPr>
+          <w:t>https://www.codechef.com/practice/course/java/LPJAAS02/problems/LJAAS15</w:t>
+        </w:r>
+      </w:hyperlink>
+    </w:p>
+    <w:p>
+      <w:pPr>
+        <w:pStyle w:val="ListParagraph"/>
+        <w:numPr>
+          <w:ilvl w:val="0"/>
+          <w:numId w:val="1"/>
+        </w:numPr>
+        <w:rPr>
+          <w:lang w:val="en-US"/>
+        </w:rPr>
+      </w:pPr>
+      <w:hyperlink r:id="rId20" w:history="1">
+        <w:r>
+          <w:rPr>
+            <w:rStyle w:val="Hyperlink"/>
+            <w:lang w:val="en-US"/>
+          </w:rPr>
+          <w:t>https://www.codechef.com/practice/course/java/LPJAAS02/problems/LJAAS16</w:t>
+        </w:r>
+      </w:hyperlink>
+    </w:p>
+    <w:p>
+      <w:pPr>
+        <w:pStyle w:val="ListParagraph"/>
+        <w:numPr>
+          <w:ilvl w:val="0"/>
+          <w:numId w:val="1"/>
+        </w:numPr>
+        <w:rPr>
+          <w:lang w:val="en-US"/>
+        </w:rPr>
+      </w:pPr>
+      <w:hyperlink r:id="rId21" w:history="1">
+        <w:r>
+          <w:rPr>
+            <w:rStyle w:val="Hyperlink"/>
+            <w:lang w:val="en-US"/>
+          </w:rPr>
+          <w:t>https://www.codechef.com/practice/course/java/LPJAAS02/problems/LJAAS17</w:t>
+        </w:r>
+      </w:hyperlink>
+    </w:p>
+    <w:p>
+      <w:pPr>
+        <w:pStyle w:val="ListParagraph"/>
+        <w:numPr>
+          <w:ilvl w:val="0"/>
+          <w:numId w:val="1"/>
+        </w:numPr>
+        <w:rPr>
+          <w:lang w:val="en-US"/>
+        </w:rPr>
+      </w:pPr>
+      <w:hyperlink r:id="rId22" w:history="1">
+        <w:r>
+          <w:rPr>
+            <w:rStyle w:val="Hyperlink"/>
+            <w:lang w:val="en-US"/>
+          </w:rPr>
+          <w:t>https://www.codechef.com/practice/course/java/LPJAAS02/problems/LJAAS18</w:t>
+        </w:r>
+      </w:hyperlink>
+    </w:p>
+    <w:p>
+      <w:pPr>
+        <w:pStyle w:val="ListParagraph"/>
+        <w:numPr>
+          <w:ilvl w:val="0"/>
+          <w:numId w:val="1"/>
+        </w:numPr>
+        <w:rPr>
+          <w:lang w:val="en-US"/>
+        </w:rPr>
+      </w:pPr>
+      <w:hyperlink r:id="rId23" w:history="1">
+        <w:r>
+          <w:rPr>
+            <w:rStyle w:val="Hyperlink"/>
+            <w:lang w:val="en-US"/>
+          </w:rPr>
+          <w:t>https://www.codechef.com/practice/course/java/LPJAAS02/problems/LJAAS19</w:t>
+        </w:r>
+      </w:hyperlink>
+    </w:p>
+    <w:p>
+      <w:pPr>
+        <w:pStyle w:val="ListParagraph"/>
+        <w:numPr>
+          <w:ilvl w:val="0"/>
+          <w:numId w:val="1"/>
+        </w:numPr>
+        <w:rPr>
+          <w:lang w:val="en-US"/>
+        </w:rPr>
+      </w:pPr>
+      <w:hyperlink r:id="rId24" w:history="1">
+        <w:r>
+          <w:rPr>
+            <w:rStyle w:val="Hyperlink"/>
+            <w:lang w:val="en-US"/>
+          </w:rPr>
+          <w:t>https://www.codechef.com/practice/course/java/LPJAAS02/problems/LJAAS20</w:t>
+        </w:r>
+      </w:hyperlink>
+    </w:p>
+    <w:p>
+      <w:pPr>
+        <w:ind w:left="360"/>
+        <w:rPr>
+          <w:lang w:val="en-US"/>
+        </w:rPr>
+      </w:pPr>
     </w:p>
     <w:p>
       <w:pPr>

</xml_diff>

<commit_message>
Added Java practice programs and updated daily practice document
</commit_message>
<xml_diff>
--- a/Assignments/dailypractice.docx
+++ b/Assignments/dailypractice.docx
@@ -441,6 +441,228 @@
           <w:t>https://www.codechef.com/practice/course/java/LPJAAS02/problems/LJAAS20</w:t>
         </w:r>
       </w:hyperlink>
+    </w:p>
+    <w:p>
+      <w:pPr>
+        <w:pStyle w:val="ListParagraph"/>
+        <w:numPr>
+          <w:ilvl w:val="0"/>
+          <w:numId w:val="1"/>
+        </w:numPr>
+        <w:rPr>
+          <w:lang w:val="en-US"/>
+        </w:rPr>
+      </w:pPr>
+      <w:hyperlink r:id="rId25" w:history="1">
+        <w:r>
+          <w:rPr>
+            <w:rStyle w:val="Hyperlink"/>
+            <w:lang w:val="en-US"/>
+          </w:rPr>
+          <w:t>https://www.codechef.com/practice/course/java/LPJAAS03/problems/LJAAS21</w:t>
+        </w:r>
+      </w:hyperlink>
+    </w:p>
+    <w:p>
+      <w:pPr>
+        <w:pStyle w:val="ListParagraph"/>
+        <w:numPr>
+          <w:ilvl w:val="0"/>
+          <w:numId w:val="1"/>
+        </w:numPr>
+        <w:rPr>
+          <w:lang w:val="en-US"/>
+        </w:rPr>
+      </w:pPr>
+      <w:hyperlink r:id="rId26" w:history="1">
+        <w:r>
+          <w:rPr>
+            <w:rStyle w:val="Hyperlink"/>
+            <w:lang w:val="en-US"/>
+          </w:rPr>
+          <w:t>https://www.codechef.com/practice/course/java/LPJAAS03/problems/LJAAS22</w:t>
+        </w:r>
+      </w:hyperlink>
+    </w:p>
+    <w:p>
+      <w:pPr>
+        <w:pStyle w:val="ListParagraph"/>
+        <w:numPr>
+          <w:ilvl w:val="0"/>
+          <w:numId w:val="1"/>
+        </w:numPr>
+        <w:rPr>
+          <w:lang w:val="en-US"/>
+        </w:rPr>
+      </w:pPr>
+      <w:hyperlink r:id="rId27" w:history="1">
+        <w:r>
+          <w:rPr>
+            <w:rStyle w:val="Hyperlink"/>
+            <w:lang w:val="en-US"/>
+          </w:rPr>
+          <w:t>https://www.codechef.com/practice/course/java/LPJAAS03/problems/LJAAS23</w:t>
+        </w:r>
+      </w:hyperlink>
+    </w:p>
+    <w:p>
+      <w:pPr>
+        <w:pStyle w:val="ListParagraph"/>
+        <w:numPr>
+          <w:ilvl w:val="0"/>
+          <w:numId w:val="1"/>
+        </w:numPr>
+        <w:rPr>
+          <w:lang w:val="en-US"/>
+        </w:rPr>
+      </w:pPr>
+      <w:hyperlink r:id="rId28" w:history="1">
+        <w:r>
+          <w:rPr>
+            <w:rStyle w:val="Hyperlink"/>
+            <w:lang w:val="en-US"/>
+          </w:rPr>
+          <w:t>https://www.codechef.com/practice/course/java/LPJAAS03/problems/LJAAS24</w:t>
+        </w:r>
+      </w:hyperlink>
+    </w:p>
+    <w:p>
+      <w:pPr>
+        <w:pStyle w:val="ListParagraph"/>
+        <w:numPr>
+          <w:ilvl w:val="0"/>
+          <w:numId w:val="1"/>
+        </w:numPr>
+        <w:rPr>
+          <w:lang w:val="en-US"/>
+        </w:rPr>
+      </w:pPr>
+      <w:hyperlink r:id="rId29" w:history="1">
+        <w:r>
+          <w:rPr>
+            <w:rStyle w:val="Hyperlink"/>
+            <w:lang w:val="en-US"/>
+          </w:rPr>
+          <w:t>https://www.codechef.com/practice/course/java/LPJAAS03/problems/LJAAS25</w:t>
+        </w:r>
+      </w:hyperlink>
+    </w:p>
+    <w:p>
+      <w:pPr>
+        <w:pStyle w:val="ListParagraph"/>
+        <w:numPr>
+          <w:ilvl w:val="0"/>
+          <w:numId w:val="1"/>
+        </w:numPr>
+        <w:rPr>
+          <w:lang w:val="en-US"/>
+        </w:rPr>
+      </w:pPr>
+      <w:hyperlink r:id="rId30" w:history="1">
+        <w:r>
+          <w:rPr>
+            <w:rStyle w:val="Hyperlink"/>
+            <w:lang w:val="en-US"/>
+          </w:rPr>
+          <w:t>https://www.codechef.com/practice/course/java/LPJAAS03/problems/LJAAS26</w:t>
+        </w:r>
+      </w:hyperlink>
+    </w:p>
+    <w:p>
+      <w:pPr>
+        <w:pStyle w:val="ListParagraph"/>
+        <w:numPr>
+          <w:ilvl w:val="0"/>
+          <w:numId w:val="1"/>
+        </w:numPr>
+        <w:rPr>
+          <w:lang w:val="en-US"/>
+        </w:rPr>
+      </w:pPr>
+      <w:hyperlink r:id="rId31" w:history="1">
+        <w:r>
+          <w:rPr>
+            <w:rStyle w:val="Hyperlink"/>
+            <w:lang w:val="en-US"/>
+          </w:rPr>
+          <w:t>https://www.codechef.com/practice/course/java/LPJAAS03/problems/LJAAS27</w:t>
+        </w:r>
+      </w:hyperlink>
+    </w:p>
+    <w:p>
+      <w:pPr>
+        <w:pStyle w:val="ListParagraph"/>
+        <w:numPr>
+          <w:ilvl w:val="0"/>
+          <w:numId w:val="1"/>
+        </w:numPr>
+        <w:rPr>
+          <w:lang w:val="en-US"/>
+        </w:rPr>
+      </w:pPr>
+      <w:hyperlink r:id="rId32" w:history="1">
+        <w:r>
+          <w:rPr>
+            <w:rStyle w:val="Hyperlink"/>
+            <w:lang w:val="en-US"/>
+          </w:rPr>
+          <w:t>https://www.codechef.com/practice/course/java/LPJAAS03/problems/LJAAS28</w:t>
+        </w:r>
+      </w:hyperlink>
+    </w:p>
+    <w:p>
+      <w:pPr>
+        <w:pStyle w:val="ListParagraph"/>
+        <w:numPr>
+          <w:ilvl w:val="0"/>
+          <w:numId w:val="1"/>
+        </w:numPr>
+        <w:rPr>
+          <w:lang w:val="en-US"/>
+        </w:rPr>
+      </w:pPr>
+      <w:hyperlink r:id="rId33" w:history="1">
+        <w:r>
+          <w:rPr>
+            <w:rStyle w:val="Hyperlink"/>
+            <w:lang w:val="en-US"/>
+          </w:rPr>
+          <w:t>https://www.codechef.com/practice/course/java/LPJAAS03/problems/LJAAS29</w:t>
+        </w:r>
+      </w:hyperlink>
+    </w:p>
+    <w:p>
+      <w:pPr>
+        <w:pStyle w:val="ListParagraph"/>
+        <w:numPr>
+          <w:ilvl w:val="0"/>
+          <w:numId w:val="1"/>
+        </w:numPr>
+        <w:rPr>
+          <w:lang w:val="en-US"/>
+        </w:rPr>
+      </w:pPr>
+      <w:hyperlink r:id="rId34" w:history="1">
+        <w:r>
+          <w:rPr>
+            <w:rStyle w:val="Hyperlink"/>
+            <w:lang w:val="en-US"/>
+          </w:rPr>
+          <w:t>https://www.codechef.com/practice/course/java/LPJAAS03/problems/LJAAS30</w:t>
+        </w:r>
+      </w:hyperlink>
+    </w:p>
+    <w:p>
+      <w:pPr>
+        <w:pStyle w:val="ListParagraph"/>
+        <w:numPr>
+          <w:ilvl w:val="0"/>
+          <w:numId w:val="1"/>
+        </w:numPr>
+        <w:rPr>
+          <w:lang w:val="en-US"/>
+        </w:rPr>
+      </w:pPr>
     </w:p>
     <w:p>
       <w:pPr>

</xml_diff>

<commit_message>
Updated daily practice document
</commit_message>
<xml_diff>
--- a/Assignments/dailypractice.docx
+++ b/Assignments/dailypractice.docx
@@ -234,6 +234,25 @@
     </w:p>
     <w:p>
       <w:pPr>
+        <w:rPr>
+          <w:lang w:val="en-US"/>
+        </w:rPr>
+      </w:pPr>
+      <w:r>
+        <w:rPr>
+          <w:lang w:val="en-US"/>
+        </w:rPr>
+        <w:t>15</w:t>
+      </w:r>
+      <w:r>
+        <w:rPr>
+          <w:lang w:val="en-US"/>
+        </w:rPr>
+        <w:t>-07-2026</w:t>
+      </w:r>
+    </w:p>
+    <w:p>
+      <w:pPr>
         <w:pStyle w:val="ListParagraph"/>
         <w:numPr>
           <w:ilvl w:val="0"/>
@@ -444,6 +463,31 @@
     </w:p>
     <w:p>
       <w:pPr>
+        <w:rPr>
+          <w:lang w:val="en-US"/>
+        </w:rPr>
+      </w:pPr>
+      <w:r>
+        <w:rPr>
+          <w:lang w:val="en-US"/>
+        </w:rPr>
+        <w:t>1</w:t>
+      </w:r>
+      <w:r>
+        <w:rPr>
+          <w:lang w:val="en-US"/>
+        </w:rPr>
+        <w:t>6</w:t>
+      </w:r>
+      <w:r>
+        <w:rPr>
+          <w:lang w:val="en-US"/>
+        </w:rPr>
+        <w:t>-07-2026</w:t>
+      </w:r>
+    </w:p>
+    <w:p>
+      <w:pPr>
         <w:pStyle w:val="ListParagraph"/>
         <w:numPr>
           <w:ilvl w:val="0"/>
@@ -654,11 +698,503 @@
     </w:p>
     <w:p>
       <w:pPr>
-        <w:pStyle w:val="ListParagraph"/>
-        <w:numPr>
-          <w:ilvl w:val="0"/>
-          <w:numId w:val="1"/>
-        </w:numPr>
+        <w:ind w:left="360"/>
+        <w:rPr>
+          <w:lang w:val="en-US"/>
+        </w:rPr>
+      </w:pPr>
+    </w:p>
+    <w:p>
+      <w:pPr>
+        <w:ind w:left="360"/>
+        <w:rPr>
+          <w:lang w:val="en-US"/>
+        </w:rPr>
+      </w:pPr>
+    </w:p>
+    <w:p>
+      <w:pPr>
+        <w:ind w:left="360"/>
+        <w:rPr>
+          <w:lang w:val="en-US"/>
+        </w:rPr>
+      </w:pPr>
+    </w:p>
+    <w:p>
+      <w:pPr>
+        <w:rPr>
+          <w:lang w:val="en-US"/>
+        </w:rPr>
+      </w:pPr>
+      <w:r>
+        <w:rPr>
+          <w:lang w:val="en-US"/>
+        </w:rPr>
+        <w:lastRenderedPageBreak/>
+        <w:t>17-07-2026</w:t>
+      </w:r>
+    </w:p>
+    <w:p>
+      <w:pPr>
+        <w:pStyle w:val="ListParagraph"/>
+        <w:numPr>
+          <w:ilvl w:val="0"/>
+          <w:numId w:val="1"/>
+        </w:numPr>
+        <w:rPr>
+          <w:lang w:val="en-US"/>
+        </w:rPr>
+      </w:pPr>
+      <w:hyperlink r:id="rId35" w:history="1">
+        <w:r>
+          <w:rPr>
+            <w:rStyle w:val="Hyperlink"/>
+            <w:lang w:val="en-US"/>
+          </w:rPr>
+          <w:t>https://www.codechef.com/practice/course/java/LPJAAS04/problems/LJAAS31</w:t>
+        </w:r>
+      </w:hyperlink>
+    </w:p>
+    <w:p>
+      <w:pPr>
+        <w:pStyle w:val="ListParagraph"/>
+        <w:numPr>
+          <w:ilvl w:val="0"/>
+          <w:numId w:val="1"/>
+        </w:numPr>
+        <w:rPr>
+          <w:lang w:val="en-US"/>
+        </w:rPr>
+      </w:pPr>
+      <w:hyperlink r:id="rId36" w:history="1">
+        <w:r>
+          <w:rPr>
+            <w:rStyle w:val="Hyperlink"/>
+            <w:lang w:val="en-US"/>
+          </w:rPr>
+          <w:t>https://www.codechef.com/practice/course/java/LPJAAS04/problems/LJAAS32</w:t>
+        </w:r>
+      </w:hyperlink>
+    </w:p>
+    <w:p>
+      <w:pPr>
+        <w:pStyle w:val="ListParagraph"/>
+        <w:numPr>
+          <w:ilvl w:val="0"/>
+          <w:numId w:val="1"/>
+        </w:numPr>
+        <w:rPr>
+          <w:lang w:val="en-US"/>
+        </w:rPr>
+      </w:pPr>
+      <w:hyperlink r:id="rId37" w:history="1">
+        <w:r>
+          <w:rPr>
+            <w:rStyle w:val="Hyperlink"/>
+            <w:lang w:val="en-US"/>
+          </w:rPr>
+          <w:t>https://www.codechef.com/practice/course/java/LPJAAS04/problems/LJAAS33</w:t>
+        </w:r>
+      </w:hyperlink>
+    </w:p>
+    <w:p>
+      <w:pPr>
+        <w:pStyle w:val="ListParagraph"/>
+        <w:numPr>
+          <w:ilvl w:val="0"/>
+          <w:numId w:val="1"/>
+        </w:numPr>
+        <w:rPr>
+          <w:lang w:val="en-US"/>
+        </w:rPr>
+      </w:pPr>
+      <w:hyperlink r:id="rId38" w:history="1">
+        <w:r>
+          <w:rPr>
+            <w:rStyle w:val="Hyperlink"/>
+            <w:lang w:val="en-US"/>
+          </w:rPr>
+          <w:t>https://www.codechef.com/practice/course/java/LPJAAS04/problems/LJAAS34</w:t>
+        </w:r>
+      </w:hyperlink>
+    </w:p>
+    <w:p>
+      <w:pPr>
+        <w:pStyle w:val="ListParagraph"/>
+        <w:numPr>
+          <w:ilvl w:val="0"/>
+          <w:numId w:val="1"/>
+        </w:numPr>
+        <w:rPr>
+          <w:lang w:val="en-US"/>
+        </w:rPr>
+      </w:pPr>
+      <w:hyperlink r:id="rId39" w:history="1">
+        <w:r>
+          <w:rPr>
+            <w:rStyle w:val="Hyperlink"/>
+            <w:lang w:val="en-US"/>
+          </w:rPr>
+          <w:t>https://www.codechef.com/practice/course/java/LPJAAS04/problems/LJAAS35</w:t>
+        </w:r>
+      </w:hyperlink>
+    </w:p>
+    <w:p>
+      <w:pPr>
+        <w:pStyle w:val="ListParagraph"/>
+        <w:numPr>
+          <w:ilvl w:val="0"/>
+          <w:numId w:val="1"/>
+        </w:numPr>
+        <w:rPr>
+          <w:lang w:val="en-US"/>
+        </w:rPr>
+      </w:pPr>
+      <w:hyperlink r:id="rId40" w:history="1">
+        <w:r>
+          <w:rPr>
+            <w:rStyle w:val="Hyperlink"/>
+            <w:lang w:val="en-US"/>
+          </w:rPr>
+          <w:t>https://www.codechef.com/practice/course/java/LPJAAS04/problems/LJAAS36</w:t>
+        </w:r>
+      </w:hyperlink>
+    </w:p>
+    <w:p>
+      <w:pPr>
+        <w:pStyle w:val="ListParagraph"/>
+        <w:numPr>
+          <w:ilvl w:val="0"/>
+          <w:numId w:val="1"/>
+        </w:numPr>
+        <w:rPr>
+          <w:lang w:val="en-US"/>
+        </w:rPr>
+      </w:pPr>
+      <w:hyperlink r:id="rId41" w:history="1">
+        <w:r>
+          <w:rPr>
+            <w:rStyle w:val="Hyperlink"/>
+            <w:lang w:val="en-US"/>
+          </w:rPr>
+          <w:t>https://www.codechef.com/practice/course/java/LPJAAS04/problems/LJAAS37</w:t>
+        </w:r>
+      </w:hyperlink>
+    </w:p>
+    <w:p>
+      <w:pPr>
+        <w:pStyle w:val="ListParagraph"/>
+        <w:numPr>
+          <w:ilvl w:val="0"/>
+          <w:numId w:val="1"/>
+        </w:numPr>
+        <w:rPr>
+          <w:lang w:val="en-US"/>
+        </w:rPr>
+      </w:pPr>
+      <w:hyperlink r:id="rId42" w:history="1">
+        <w:r>
+          <w:rPr>
+            <w:rStyle w:val="Hyperlink"/>
+            <w:lang w:val="en-US"/>
+          </w:rPr>
+          <w:t>https://www.codechef.com/practice/course/java/LPJAAS04/problems/LJAAS38</w:t>
+        </w:r>
+      </w:hyperlink>
+    </w:p>
+    <w:p>
+      <w:pPr>
+        <w:pStyle w:val="ListParagraph"/>
+        <w:numPr>
+          <w:ilvl w:val="0"/>
+          <w:numId w:val="1"/>
+        </w:numPr>
+        <w:rPr>
+          <w:lang w:val="en-US"/>
+        </w:rPr>
+      </w:pPr>
+      <w:hyperlink r:id="rId43" w:history="1">
+        <w:r>
+          <w:rPr>
+            <w:rStyle w:val="Hyperlink"/>
+            <w:lang w:val="en-US"/>
+          </w:rPr>
+          <w:t>https://www.codechef.com/practice/course/java/LPJAAS04/problems/LJAAS39</w:t>
+        </w:r>
+      </w:hyperlink>
+    </w:p>
+    <w:p>
+      <w:pPr>
+        <w:pStyle w:val="ListParagraph"/>
+        <w:numPr>
+          <w:ilvl w:val="0"/>
+          <w:numId w:val="1"/>
+        </w:numPr>
+        <w:rPr>
+          <w:lang w:val="en-US"/>
+        </w:rPr>
+      </w:pPr>
+      <w:hyperlink r:id="rId44" w:history="1">
+        <w:r>
+          <w:rPr>
+            <w:rStyle w:val="Hyperlink"/>
+            <w:lang w:val="en-US"/>
+          </w:rPr>
+          <w:t>https://www.codechef.com/practice/course/java/LPJAAS04/problems/LJAAS40</w:t>
+        </w:r>
+      </w:hyperlink>
+    </w:p>
+    <w:p>
+      <w:pPr>
+        <w:rPr>
+          <w:lang w:val="en-US"/>
+        </w:rPr>
+      </w:pPr>
+      <w:r>
+        <w:rPr>
+          <w:lang w:val="en-US"/>
+        </w:rPr>
+        <w:t>18-07-2026</w:t>
+      </w:r>
+    </w:p>
+    <w:p>
+      <w:pPr>
+        <w:pStyle w:val="ListParagraph"/>
+        <w:numPr>
+          <w:ilvl w:val="0"/>
+          <w:numId w:val="1"/>
+        </w:numPr>
+        <w:rPr>
+          <w:lang w:val="en-US"/>
+        </w:rPr>
+      </w:pPr>
+      <w:hyperlink r:id="rId45" w:history="1">
+        <w:r>
+          <w:rPr>
+            <w:rStyle w:val="Hyperlink"/>
+            <w:lang w:val="en-US"/>
+          </w:rPr>
+          <w:t>https://www.codechef.com/practice/course/java/LPJAAS05/problems/LJAAS41</w:t>
+        </w:r>
+      </w:hyperlink>
+    </w:p>
+    <w:p>
+      <w:pPr>
+        <w:pStyle w:val="ListParagraph"/>
+        <w:numPr>
+          <w:ilvl w:val="0"/>
+          <w:numId w:val="1"/>
+        </w:numPr>
+        <w:rPr>
+          <w:lang w:val="en-US"/>
+        </w:rPr>
+      </w:pPr>
+      <w:hyperlink r:id="rId46" w:history="1">
+        <w:r>
+          <w:rPr>
+            <w:rStyle w:val="Hyperlink"/>
+            <w:lang w:val="en-US"/>
+          </w:rPr>
+          <w:t>https://www.codechef.com/practice/course/java/LPJAAS05/problems/LJAAS42\</w:t>
+        </w:r>
+      </w:hyperlink>
+    </w:p>
+    <w:p>
+      <w:pPr>
+        <w:pStyle w:val="ListParagraph"/>
+        <w:numPr>
+          <w:ilvl w:val="0"/>
+          <w:numId w:val="1"/>
+        </w:numPr>
+        <w:rPr>
+          <w:lang w:val="en-US"/>
+        </w:rPr>
+      </w:pPr>
+      <w:hyperlink r:id="rId47" w:history="1">
+        <w:r>
+          <w:rPr>
+            <w:rStyle w:val="Hyperlink"/>
+            <w:lang w:val="en-US"/>
+          </w:rPr>
+          <w:t>https://www.codechef.com/practice/course/java/LPJAAS05/problems/LJAAS43</w:t>
+        </w:r>
+      </w:hyperlink>
+    </w:p>
+    <w:p>
+      <w:pPr>
+        <w:pStyle w:val="ListParagraph"/>
+        <w:numPr>
+          <w:ilvl w:val="0"/>
+          <w:numId w:val="1"/>
+        </w:numPr>
+        <w:rPr>
+          <w:lang w:val="en-US"/>
+        </w:rPr>
+      </w:pPr>
+      <w:hyperlink r:id="rId48" w:history="1">
+        <w:r>
+          <w:rPr>
+            <w:rStyle w:val="Hyperlink"/>
+            <w:lang w:val="en-US"/>
+          </w:rPr>
+          <w:t>https://www.codechef.com/practice/course/java/LPJAAS05/problems/LJAAS44</w:t>
+        </w:r>
+      </w:hyperlink>
+    </w:p>
+    <w:p>
+      <w:pPr>
+        <w:pStyle w:val="ListParagraph"/>
+        <w:numPr>
+          <w:ilvl w:val="0"/>
+          <w:numId w:val="1"/>
+        </w:numPr>
+        <w:rPr>
+          <w:lang w:val="en-US"/>
+        </w:rPr>
+      </w:pPr>
+      <w:hyperlink r:id="rId49" w:history="1">
+        <w:r>
+          <w:rPr>
+            <w:rStyle w:val="Hyperlink"/>
+            <w:lang w:val="en-US"/>
+          </w:rPr>
+          <w:t>https://www.codechef.com/practice/course/java/LPJAAS05/problems/LJAAS45</w:t>
+        </w:r>
+      </w:hyperlink>
+    </w:p>
+    <w:p>
+      <w:pPr>
+        <w:pStyle w:val="ListParagraph"/>
+        <w:numPr>
+          <w:ilvl w:val="0"/>
+          <w:numId w:val="1"/>
+        </w:numPr>
+        <w:rPr>
+          <w:lang w:val="en-US"/>
+        </w:rPr>
+      </w:pPr>
+      <w:hyperlink r:id="rId50" w:history="1">
+        <w:r>
+          <w:rPr>
+            <w:rStyle w:val="Hyperlink"/>
+            <w:lang w:val="en-US"/>
+          </w:rPr>
+          <w:t>https://www.codechef.com/practice/course/java/LPJAAS05/problems/LJAAS46</w:t>
+        </w:r>
+      </w:hyperlink>
+    </w:p>
+    <w:p>
+      <w:pPr>
+        <w:pStyle w:val="ListParagraph"/>
+        <w:numPr>
+          <w:ilvl w:val="0"/>
+          <w:numId w:val="1"/>
+        </w:numPr>
+        <w:rPr>
+          <w:lang w:val="en-US"/>
+        </w:rPr>
+      </w:pPr>
+      <w:hyperlink r:id="rId51" w:history="1">
+        <w:r>
+          <w:rPr>
+            <w:rStyle w:val="Hyperlink"/>
+            <w:lang w:val="en-US"/>
+          </w:rPr>
+          <w:t>https://www.codechef.com/practice/course/java/LPJAAS05/problems/LJAAS47</w:t>
+        </w:r>
+      </w:hyperlink>
+    </w:p>
+    <w:p>
+      <w:pPr>
+        <w:pStyle w:val="ListParagraph"/>
+        <w:numPr>
+          <w:ilvl w:val="0"/>
+          <w:numId w:val="1"/>
+        </w:numPr>
+        <w:rPr>
+          <w:lang w:val="en-US"/>
+        </w:rPr>
+      </w:pPr>
+      <w:hyperlink r:id="rId52" w:history="1">
+        <w:r>
+          <w:rPr>
+            <w:rStyle w:val="Hyperlink"/>
+            <w:lang w:val="en-US"/>
+          </w:rPr>
+          <w:t>https://www.codechef.com/practice/course/java/LPJAAS05/problems/LJAAS48</w:t>
+        </w:r>
+      </w:hyperlink>
+    </w:p>
+    <w:p>
+      <w:pPr>
+        <w:pStyle w:val="ListParagraph"/>
+        <w:numPr>
+          <w:ilvl w:val="0"/>
+          <w:numId w:val="1"/>
+        </w:numPr>
+        <w:rPr>
+          <w:lang w:val="en-US"/>
+        </w:rPr>
+      </w:pPr>
+      <w:hyperlink r:id="rId53" w:history="1">
+        <w:r>
+          <w:rPr>
+            <w:rStyle w:val="Hyperlink"/>
+            <w:lang w:val="en-US"/>
+          </w:rPr>
+          <w:t>https://www.codechef.com/practice/course/java/LPJAAS05/problems/LJAAS49</w:t>
+        </w:r>
+      </w:hyperlink>
+    </w:p>
+    <w:p>
+      <w:pPr>
+        <w:pStyle w:val="ListParagraph"/>
+        <w:numPr>
+          <w:ilvl w:val="0"/>
+          <w:numId w:val="1"/>
+        </w:numPr>
+        <w:rPr>
+          <w:lang w:val="en-US"/>
+        </w:rPr>
+      </w:pPr>
+      <w:hyperlink r:id="rId54" w:history="1">
+        <w:r>
+          <w:rPr>
+            <w:rStyle w:val="Hyperlink"/>
+            <w:lang w:val="en-US"/>
+          </w:rPr>
+          <w:t>https://www.codechef.com/practice/course/java/LPJAAS05/problems/LJAAS50</w:t>
+        </w:r>
+      </w:hyperlink>
+    </w:p>
+    <w:p>
+      <w:pPr>
+        <w:rPr>
+          <w:lang w:val="en-US"/>
+        </w:rPr>
+      </w:pPr>
+      <w:r>
+        <w:rPr>
+          <w:lang w:val="en-US"/>
+        </w:rPr>
+        <w:t>19-07-2026</w:t>
+      </w:r>
+    </w:p>
+    <w:p>
+      <w:pPr>
+        <w:pStyle w:val="ListParagraph"/>
+        <w:numPr>
+          <w:ilvl w:val="0"/>
+          <w:numId w:val="1"/>
+        </w:numPr>
+        <w:rPr>
+          <w:lang w:val="en-US"/>
+        </w:rPr>
+      </w:pPr>
+    </w:p>
+    <w:p>
+      <w:pPr>
+        <w:ind w:left="360"/>
         <w:rPr>
           <w:lang w:val="en-US"/>
         </w:rPr>
@@ -1187,6 +1723,7 @@
   <w:style w:type="paragraph" w:default="1" w:styleId="Normal">
     <w:name w:val="Normal"/>
     <w:qFormat/>
+    <w:rsid w:val="00382B4C"/>
   </w:style>
   <w:style w:type="paragraph" w:styleId="Heading1">
     <w:name w:val="heading 1"/>

</xml_diff>

<commit_message>
Added new assignments and updated dailypractice
</commit_message>
<xml_diff>
--- a/Assignments/dailypractice.docx
+++ b/Assignments/dailypractice.docx
@@ -1187,6 +1187,448 @@
           <w:ilvl w:val="0"/>
           <w:numId w:val="1"/>
         </w:numPr>
+        <w:rPr>
+          <w:lang w:val="en-US"/>
+        </w:rPr>
+      </w:pPr>
+      <w:hyperlink r:id="rId55" w:history="1">
+        <w:r>
+          <w:rPr>
+            <w:rStyle w:val="Hyperlink"/>
+            <w:lang w:val="en-US"/>
+          </w:rPr>
+          <w:t>https://www.codechef.com/practice/course/java/PJA01/problems/JPRACMCQ1</w:t>
+        </w:r>
+      </w:hyperlink>
+    </w:p>
+    <w:p>
+      <w:pPr>
+        <w:pStyle w:val="ListParagraph"/>
+        <w:numPr>
+          <w:ilvl w:val="0"/>
+          <w:numId w:val="1"/>
+        </w:numPr>
+        <w:rPr>
+          <w:lang w:val="en-US"/>
+        </w:rPr>
+      </w:pPr>
+      <w:hyperlink r:id="rId56" w:history="1">
+        <w:r>
+          <w:rPr>
+            <w:rStyle w:val="Hyperlink"/>
+            <w:lang w:val="en-US"/>
+          </w:rPr>
+          <w:t>https://www.codechef.com/practice/course/java/PJA01/problems/START01</w:t>
+        </w:r>
+      </w:hyperlink>
+    </w:p>
+    <w:p>
+      <w:pPr>
+        <w:pStyle w:val="ListParagraph"/>
+        <w:numPr>
+          <w:ilvl w:val="0"/>
+          <w:numId w:val="1"/>
+        </w:numPr>
+        <w:rPr>
+          <w:lang w:val="en-US"/>
+        </w:rPr>
+      </w:pPr>
+      <w:hyperlink r:id="rId57" w:history="1">
+        <w:r>
+          <w:rPr>
+            <w:rStyle w:val="Hyperlink"/>
+            <w:lang w:val="en-US"/>
+          </w:rPr>
+          <w:t>https://www.codechef.com/practice/course/java/PJA01/problems/JPRACREAR</w:t>
+        </w:r>
+        <w:r>
+          <w:rPr>
+            <w:rStyle w:val="Hyperlink"/>
+            <w:lang w:val="en-US"/>
+          </w:rPr>
+          <w:t>R</w:t>
+        </w:r>
+        <w:r>
+          <w:rPr>
+            <w:rStyle w:val="Hyperlink"/>
+            <w:lang w:val="en-US"/>
+          </w:rPr>
+          <w:t>1</w:t>
+        </w:r>
+      </w:hyperlink>
+    </w:p>
+    <w:p>
+      <w:pPr>
+        <w:pStyle w:val="ListParagraph"/>
+        <w:numPr>
+          <w:ilvl w:val="0"/>
+          <w:numId w:val="1"/>
+        </w:numPr>
+        <w:rPr>
+          <w:lang w:val="en-US"/>
+        </w:rPr>
+      </w:pPr>
+      <w:hyperlink r:id="rId58" w:history="1">
+        <w:r>
+          <w:rPr>
+            <w:rStyle w:val="Hyperlink"/>
+            <w:lang w:val="en-US"/>
+          </w:rPr>
+          <w:t>https://www.codechef.com/practice/course/java/PJA01/problems/JPRACREAR1A</w:t>
+        </w:r>
+      </w:hyperlink>
+    </w:p>
+    <w:p>
+      <w:pPr>
+        <w:pStyle w:val="ListParagraph"/>
+        <w:numPr>
+          <w:ilvl w:val="0"/>
+          <w:numId w:val="1"/>
+        </w:numPr>
+        <w:rPr>
+          <w:lang w:val="en-US"/>
+        </w:rPr>
+      </w:pPr>
+      <w:hyperlink r:id="rId59" w:history="1">
+        <w:r>
+          <w:rPr>
+            <w:rStyle w:val="Hyperlink"/>
+            <w:lang w:val="en-US"/>
+          </w:rPr>
+          <w:t>https://www.codechef.com/practice/course/java/PJA01/problems/INSTNOODLE</w:t>
+        </w:r>
+      </w:hyperlink>
+    </w:p>
+    <w:p>
+      <w:pPr>
+        <w:pStyle w:val="ListParagraph"/>
+        <w:numPr>
+          <w:ilvl w:val="0"/>
+          <w:numId w:val="1"/>
+        </w:numPr>
+        <w:rPr>
+          <w:lang w:val="en-US"/>
+        </w:rPr>
+      </w:pPr>
+      <w:hyperlink r:id="rId60" w:history="1">
+        <w:r>
+          <w:rPr>
+            <w:rStyle w:val="Hyperlink"/>
+            <w:lang w:val="en-US"/>
+          </w:rPr>
+          <w:t>https://www.codechef.com/practice/course/java/PJA01/problems/JPRACMCQ4</w:t>
+        </w:r>
+      </w:hyperlink>
+    </w:p>
+    <w:p>
+      <w:pPr>
+        <w:pStyle w:val="ListParagraph"/>
+        <w:numPr>
+          <w:ilvl w:val="0"/>
+          <w:numId w:val="1"/>
+        </w:numPr>
+        <w:rPr>
+          <w:lang w:val="en-US"/>
+        </w:rPr>
+      </w:pPr>
+      <w:hyperlink r:id="rId61" w:history="1">
+        <w:r>
+          <w:rPr>
+            <w:rStyle w:val="Hyperlink"/>
+            <w:lang w:val="en-US"/>
+          </w:rPr>
+          <w:t>https://www.codechef.com/practice/course/java/PJA01/problems/CCLEARN</w:t>
+        </w:r>
+      </w:hyperlink>
+    </w:p>
+    <w:p>
+      <w:pPr>
+        <w:pStyle w:val="ListParagraph"/>
+        <w:numPr>
+          <w:ilvl w:val="0"/>
+          <w:numId w:val="1"/>
+        </w:numPr>
+        <w:rPr>
+          <w:lang w:val="en-US"/>
+        </w:rPr>
+      </w:pPr>
+      <w:hyperlink r:id="rId62" w:history="1">
+        <w:r>
+          <w:rPr>
+            <w:rStyle w:val="Hyperlink"/>
+            <w:lang w:val="en-US"/>
+          </w:rPr>
+          <w:t>https://www.codechef.com/practice/course/java/PJA02/problems/JPRACMCQ2</w:t>
+        </w:r>
+      </w:hyperlink>
+    </w:p>
+    <w:p>
+      <w:pPr>
+        <w:pStyle w:val="ListParagraph"/>
+        <w:numPr>
+          <w:ilvl w:val="0"/>
+          <w:numId w:val="1"/>
+        </w:numPr>
+        <w:rPr>
+          <w:lang w:val="en-US"/>
+        </w:rPr>
+      </w:pPr>
+      <w:hyperlink r:id="rId63" w:history="1">
+        <w:r>
+          <w:rPr>
+            <w:rStyle w:val="Hyperlink"/>
+            <w:lang w:val="en-US"/>
+          </w:rPr>
+          <w:t>https://www.codechef.com/practice/course/java/PJA02/problems/LEARNSQL</w:t>
+        </w:r>
+      </w:hyperlink>
+    </w:p>
+    <w:p>
+      <w:pPr>
+        <w:pStyle w:val="ListParagraph"/>
+        <w:numPr>
+          <w:ilvl w:val="0"/>
+          <w:numId w:val="1"/>
+        </w:numPr>
+        <w:rPr>
+          <w:lang w:val="en-US"/>
+        </w:rPr>
+      </w:pPr>
+      <w:hyperlink r:id="rId64" w:history="1">
+        <w:r>
+          <w:rPr>
+            <w:rStyle w:val="Hyperlink"/>
+            <w:lang w:val="en-US"/>
+          </w:rPr>
+          <w:t>https://www.codechef.com/practice/course/java/PJA02/problems/JPRACMCQ3</w:t>
+        </w:r>
+      </w:hyperlink>
+    </w:p>
+    <w:p>
+      <w:pPr>
+        <w:rPr>
+          <w:lang w:val="en-US"/>
+        </w:rPr>
+      </w:pPr>
+      <w:r>
+        <w:rPr>
+          <w:lang w:val="en-US"/>
+        </w:rPr>
+        <w:t>20-07-2026</w:t>
+      </w:r>
+    </w:p>
+    <w:p>
+      <w:pPr>
+        <w:pStyle w:val="ListParagraph"/>
+        <w:numPr>
+          <w:ilvl w:val="0"/>
+          <w:numId w:val="1"/>
+        </w:numPr>
+        <w:rPr>
+          <w:lang w:val="en-US"/>
+        </w:rPr>
+      </w:pPr>
+      <w:hyperlink r:id="rId65" w:history="1">
+        <w:r>
+          <w:rPr>
+            <w:rStyle w:val="Hyperlink"/>
+            <w:lang w:val="en-US"/>
+          </w:rPr>
+          <w:t>https://www.codechef.com/practice/course/java/PJA02/problems/PARKINGCHARG</w:t>
+        </w:r>
+      </w:hyperlink>
+    </w:p>
+    <w:p>
+      <w:pPr>
+        <w:pStyle w:val="ListParagraph"/>
+        <w:numPr>
+          <w:ilvl w:val="0"/>
+          <w:numId w:val="1"/>
+        </w:numPr>
+        <w:rPr>
+          <w:lang w:val="en-US"/>
+        </w:rPr>
+      </w:pPr>
+      <w:hyperlink r:id="rId66" w:history="1">
+        <w:r>
+          <w:rPr>
+            <w:rStyle w:val="Hyperlink"/>
+            <w:lang w:val="en-US"/>
+          </w:rPr>
+          <w:t>https://www.codechef.com/practice/course/java/LPJAAS06/problems/LJAAS51</w:t>
+        </w:r>
+      </w:hyperlink>
+    </w:p>
+    <w:p>
+      <w:pPr>
+        <w:pStyle w:val="ListParagraph"/>
+        <w:numPr>
+          <w:ilvl w:val="0"/>
+          <w:numId w:val="1"/>
+        </w:numPr>
+        <w:rPr>
+          <w:lang w:val="en-US"/>
+        </w:rPr>
+      </w:pPr>
+      <w:hyperlink r:id="rId67" w:history="1">
+        <w:r>
+          <w:rPr>
+            <w:rStyle w:val="Hyperlink"/>
+            <w:lang w:val="en-US"/>
+          </w:rPr>
+          <w:t>https://www.codechef.com/practice/course/java/LPJAAS06/problems/LJAAS52</w:t>
+        </w:r>
+      </w:hyperlink>
+    </w:p>
+    <w:p>
+      <w:pPr>
+        <w:pStyle w:val="ListParagraph"/>
+        <w:numPr>
+          <w:ilvl w:val="0"/>
+          <w:numId w:val="1"/>
+        </w:numPr>
+        <w:rPr>
+          <w:lang w:val="en-US"/>
+        </w:rPr>
+      </w:pPr>
+      <w:hyperlink r:id="rId68" w:history="1">
+        <w:r>
+          <w:rPr>
+            <w:rStyle w:val="Hyperlink"/>
+            <w:lang w:val="en-US"/>
+          </w:rPr>
+          <w:t>https://www.codechef.com/practice/course/java/LPJAAS06/problems/LJAAS53</w:t>
+        </w:r>
+      </w:hyperlink>
+    </w:p>
+    <w:p>
+      <w:pPr>
+        <w:pStyle w:val="ListParagraph"/>
+        <w:numPr>
+          <w:ilvl w:val="0"/>
+          <w:numId w:val="1"/>
+        </w:numPr>
+        <w:rPr>
+          <w:lang w:val="en-US"/>
+        </w:rPr>
+      </w:pPr>
+      <w:hyperlink r:id="rId69" w:history="1">
+        <w:r>
+          <w:rPr>
+            <w:rStyle w:val="Hyperlink"/>
+            <w:lang w:val="en-US"/>
+          </w:rPr>
+          <w:t>https://www.codechef.com/practice/course/java/LPJAAS06/problems/LJAAS54</w:t>
+        </w:r>
+      </w:hyperlink>
+    </w:p>
+    <w:p>
+      <w:pPr>
+        <w:pStyle w:val="ListParagraph"/>
+        <w:numPr>
+          <w:ilvl w:val="0"/>
+          <w:numId w:val="1"/>
+        </w:numPr>
+        <w:rPr>
+          <w:lang w:val="en-US"/>
+        </w:rPr>
+      </w:pPr>
+      <w:hyperlink r:id="rId70" w:history="1">
+        <w:r>
+          <w:rPr>
+            <w:rStyle w:val="Hyperlink"/>
+            <w:lang w:val="en-US"/>
+          </w:rPr>
+          <w:t>https://www.codechef.com/practice/course/java/LPJAAS06/problems/LJAAS55</w:t>
+        </w:r>
+      </w:hyperlink>
+    </w:p>
+    <w:p>
+      <w:pPr>
+        <w:pStyle w:val="ListParagraph"/>
+        <w:numPr>
+          <w:ilvl w:val="0"/>
+          <w:numId w:val="1"/>
+        </w:numPr>
+        <w:rPr>
+          <w:lang w:val="en-US"/>
+        </w:rPr>
+      </w:pPr>
+      <w:hyperlink r:id="rId71" w:history="1">
+        <w:r>
+          <w:rPr>
+            <w:rStyle w:val="Hyperlink"/>
+            <w:lang w:val="en-US"/>
+          </w:rPr>
+          <w:t>https://www.codechef.com/practice/course/java/LPJAAS06/problems/LJAAS56</w:t>
+        </w:r>
+      </w:hyperlink>
+    </w:p>
+    <w:p>
+      <w:pPr>
+        <w:pStyle w:val="ListParagraph"/>
+        <w:numPr>
+          <w:ilvl w:val="0"/>
+          <w:numId w:val="1"/>
+        </w:numPr>
+        <w:rPr>
+          <w:lang w:val="en-US"/>
+        </w:rPr>
+      </w:pPr>
+      <w:hyperlink r:id="rId72" w:history="1">
+        <w:r>
+          <w:rPr>
+            <w:rStyle w:val="Hyperlink"/>
+            <w:lang w:val="en-US"/>
+          </w:rPr>
+          <w:t>https://www.codechef.com/practice/course/java/LPJAAS06/problems/LJAAS57</w:t>
+        </w:r>
+      </w:hyperlink>
+    </w:p>
+    <w:p>
+      <w:pPr>
+        <w:pStyle w:val="ListParagraph"/>
+        <w:numPr>
+          <w:ilvl w:val="0"/>
+          <w:numId w:val="1"/>
+        </w:numPr>
+        <w:rPr>
+          <w:lang w:val="en-US"/>
+        </w:rPr>
+      </w:pPr>
+      <w:hyperlink r:id="rId73" w:history="1">
+        <w:r>
+          <w:rPr>
+            <w:rStyle w:val="Hyperlink"/>
+            <w:lang w:val="en-US"/>
+          </w:rPr>
+          <w:t>https://www.codechef.com/practice/course/java/LPJAAS06/problems/LJAAS58</w:t>
+        </w:r>
+      </w:hyperlink>
+    </w:p>
+    <w:p>
+      <w:pPr>
+        <w:pStyle w:val="ListParagraph"/>
+        <w:numPr>
+          <w:ilvl w:val="0"/>
+          <w:numId w:val="1"/>
+        </w:numPr>
+        <w:rPr>
+          <w:lang w:val="en-US"/>
+        </w:rPr>
+      </w:pPr>
+      <w:hyperlink r:id="rId74" w:history="1">
+        <w:r>
+          <w:rPr>
+            <w:rStyle w:val="Hyperlink"/>
+            <w:lang w:val="en-US"/>
+          </w:rPr>
+          <w:t>https://www.codechef.com/practice/course/java/LPJAAS06/problems/LJAAS59</w:t>
+        </w:r>
+      </w:hyperlink>
+    </w:p>
+    <w:p>
+      <w:pPr>
         <w:rPr>
           <w:lang w:val="en-US"/>
         </w:rPr>
@@ -1238,7 +1680,7 @@
       <w:lvlText w:val="%1."/>
       <w:lvlJc w:val="left"/>
       <w:pPr>
-        <w:ind w:left="720" w:hanging="360"/>
+        <w:ind w:left="360" w:hanging="360"/>
       </w:pPr>
       <w:rPr>
         <w:rFonts w:hint="default"/>
@@ -2264,6 +2706,18 @@
       <w:shd w:val="clear" w:color="auto" w:fill="E1DFDD"/>
     </w:rPr>
   </w:style>
+  <w:style w:type="character" w:styleId="FollowedHyperlink">
+    <w:name w:val="FollowedHyperlink"/>
+    <w:basedOn w:val="DefaultParagraphFont"/>
+    <w:uiPriority w:val="99"/>
+    <w:semiHidden/>
+    <w:unhideWhenUsed/>
+    <w:rsid w:val="008F5FFF"/>
+    <w:rPr>
+      <w:color w:val="96607D" w:themeColor="followedHyperlink"/>
+      <w:u w:val="single"/>
+    </w:rPr>
+  </w:style>
 </w:styles>
 </file>
 

</xml_diff>